<commit_message>
Update portfolio with resume-based content
</commit_message>
<xml_diff>
--- a/public/Rahul_Byrapuneni_Resume.docx
+++ b/public/Rahul_Byrapuneni_Resume.docx
@@ -1148,7 +1148,7 @@
           <w:sz w:val="21"/>
           <w:szCs w:val="21"/>
         </w:rPr>
-        <w:t>America (Client:</w:t>
+        <w:t xml:space="preserve">America </w:t>
       </w:r>
       <w:r>
         <w:rPr>
@@ -1159,62 +1159,7 @@
           <w:sz w:val="21"/>
           <w:szCs w:val="21"/>
         </w:rPr>
-        <w:t xml:space="preserve"> Dartmouth</w:t>
-      </w:r>
-      <w:r>
-        <w:rPr>
-          <w:rFonts w:ascii="Calibri" w:eastAsia="Palatino Linotype" w:hAnsi="Calibri" w:cs="Calibri"/>
-          <w:i/>
-          <w:iCs/>
-          <w:color w:val="000000" w:themeColor="text1"/>
-          <w:sz w:val="21"/>
-          <w:szCs w:val="21"/>
-        </w:rPr>
-        <w:t xml:space="preserve"> Health</w:t>
-      </w:r>
-      <w:r>
-        <w:rPr>
-          <w:rFonts w:ascii="Calibri" w:eastAsia="Palatino Linotype" w:hAnsi="Calibri" w:cs="Calibri"/>
-          <w:i/>
-          <w:iCs/>
-          <w:color w:val="000000" w:themeColor="text1"/>
-          <w:sz w:val="21"/>
-          <w:szCs w:val="21"/>
-        </w:rPr>
-        <w:t>)</w:t>
-      </w:r>
-      <w:r>
-        <w:rPr>
-          <w:rFonts w:ascii="Calibri" w:eastAsia="Palatino Linotype" w:hAnsi="Calibri" w:cs="Calibri"/>
-          <w:i/>
-          <w:iCs/>
-          <w:color w:val="000000" w:themeColor="text1"/>
-          <w:sz w:val="21"/>
-          <w:szCs w:val="21"/>
-        </w:rPr>
-        <w:t xml:space="preserve"> – </w:t>
-      </w:r>
-      <w:r>
-        <w:rPr>
-          <w:rFonts w:ascii="Calibri" w:eastAsia="Palatino Linotype" w:hAnsi="Calibri" w:cs="Calibri"/>
-          <w:i/>
-          <w:iCs/>
-          <w:color w:val="000000" w:themeColor="text1"/>
-          <w:sz w:val="21"/>
-          <w:szCs w:val="21"/>
-        </w:rPr>
-        <w:t>Lebanon</w:t>
-      </w:r>
-      <w:r>
-        <w:rPr>
-          <w:rFonts w:ascii="Calibri" w:eastAsia="Palatino Linotype" w:hAnsi="Calibri" w:cs="Calibri"/>
-          <w:i/>
-          <w:iCs/>
-          <w:color w:val="000000" w:themeColor="text1"/>
-          <w:sz w:val="21"/>
-          <w:szCs w:val="21"/>
-        </w:rPr>
-        <w:t>, NH</w:t>
+        <w:t>– NH</w:t>
       </w:r>
       <w:r>
         <w:rPr>
@@ -1248,6 +1193,39 @@
           <w:szCs w:val="21"/>
         </w:rPr>
         <w:t xml:space="preserve">  </w:t>
+      </w:r>
+      <w:r>
+        <w:rPr>
+          <w:rFonts w:ascii="Calibri" w:eastAsia="Palatino Linotype" w:hAnsi="Calibri" w:cs="Calibri"/>
+          <w:b/>
+          <w:bCs/>
+          <w:color w:val="000000" w:themeColor="text1"/>
+          <w:sz w:val="21"/>
+          <w:szCs w:val="21"/>
+        </w:rPr>
+        <w:t xml:space="preserve">                                                            </w:t>
+      </w:r>
+      <w:r>
+        <w:rPr>
+          <w:rFonts w:ascii="Calibri" w:eastAsia="Palatino Linotype" w:hAnsi="Calibri" w:cs="Calibri"/>
+          <w:b/>
+          <w:bCs/>
+          <w:color w:val="000000" w:themeColor="text1"/>
+          <w:sz w:val="21"/>
+          <w:szCs w:val="21"/>
+        </w:rPr>
+        <w:t xml:space="preserve">    </w:t>
+      </w:r>
+      <w:r>
+        <w:rPr>
+          <w:rFonts w:ascii="Calibri" w:eastAsia="Palatino Linotype" w:hAnsi="Calibri" w:cs="Calibri"/>
+          <w:b/>
+          <w:bCs/>
+          <w:color w:val="000000" w:themeColor="text1"/>
+          <w:sz w:val="21"/>
+          <w:szCs w:val="21"/>
+        </w:rPr>
+        <w:t xml:space="preserve"> </w:t>
       </w:r>
       <w:r>
         <w:rPr>
@@ -1282,25 +1260,25 @@
           <w:sz w:val="21"/>
           <w:szCs w:val="21"/>
         </w:rPr>
-        <w:t xml:space="preserve">Designed ETL pipelines to extract structured/unstructured data from </w:t>
-      </w:r>
-      <w:r>
-        <w:rPr>
-          <w:rFonts w:ascii="Calibri" w:eastAsia="Palatino Linotype" w:hAnsi="Calibri" w:cs="Calibri"/>
-          <w:color w:val="000000" w:themeColor="text1"/>
-          <w:sz w:val="21"/>
-          <w:szCs w:val="21"/>
-        </w:rPr>
-        <w:t xml:space="preserve">Epic and </w:t>
-      </w:r>
-      <w:r>
-        <w:rPr>
-          <w:rFonts w:ascii="Calibri" w:eastAsia="Palatino Linotype" w:hAnsi="Calibri" w:cs="Calibri"/>
-          <w:color w:val="000000" w:themeColor="text1"/>
-          <w:sz w:val="21"/>
-          <w:szCs w:val="21"/>
-        </w:rPr>
-        <w:t>Cerner EHR, improving data acquisition</w:t>
+        <w:t>Designed ETL pipelines to extract structured/unstructured data from</w:t>
+      </w:r>
+      <w:r>
+        <w:rPr>
+          <w:rFonts w:ascii="Calibri" w:eastAsia="Palatino Linotype" w:hAnsi="Calibri" w:cs="Calibri"/>
+          <w:color w:val="000000" w:themeColor="text1"/>
+          <w:sz w:val="21"/>
+          <w:szCs w:val="21"/>
+        </w:rPr>
+        <w:t xml:space="preserve"> EHR's</w:t>
+      </w:r>
+      <w:r>
+        <w:rPr>
+          <w:rFonts w:ascii="Calibri" w:eastAsia="Palatino Linotype" w:hAnsi="Calibri" w:cs="Calibri"/>
+          <w:color w:val="000000" w:themeColor="text1"/>
+          <w:sz w:val="21"/>
+          <w:szCs w:val="21"/>
+        </w:rPr>
+        <w:t>, improving data acquisition</w:t>
       </w:r>
       <w:r>
         <w:rPr>

</xml_diff>